<commit_message>
Supplement: add a to-complete box listing the information still needed before submission
Co-Authored-By: Claude Opus 5.5 <noreply@anthropic.com>
</commit_message>
<xml_diff>
--- a/docs/supplement_marker_timing_calibration_2026-10-15.docx
+++ b/docs/supplement_marker_timing_calibration_2026-10-15.docx
@@ -50,6 +50,144 @@
         </w:rPr>
         <w:t>, commit [to be inserted at submission]).</w:t>
       </w:r>
+    </w:p>
+    <w:tbl>
+      <w:tblPr>
+        <w:tblStyle w:val="TableGrid"/>
+        <w:tblW w:type="auto" w:w="0"/>
+        <w:tblLook w:firstColumn="1" w:firstRow="1" w:lastColumn="0" w:lastRow="0" w:noHBand="0" w:noVBand="1" w:val="04A0"/>
+      </w:tblPr>
+      <w:tblGrid>
+        <w:gridCol w:w="9648"/>
+      </w:tblGrid>
+      <w:tr>
+        <w:tc>
+          <w:tcPr>
+            <w:tcW w:type="dxa" w:w="9648"/>
+            <w:shd w:val="clear" w:color="auto" w:fill="FFF4CE"/>
+          </w:tcPr>
+          <w:p>
+            <w:r/>
+            <w:r>
+              <w:rPr>
+                <w:b/>
+                <w:sz w:val="20"/>
+              </w:rPr>
+              <w:t>TO COMPLETE BEFORE SUBMISSION (delete this box)</w:t>
+            </w:r>
+          </w:p>
+          <w:p>
+            <w:pPr>
+              <w:pStyle w:val="ListBullet"/>
+              <w:spacing w:after="20"/>
+            </w:pPr>
+            <w:r>
+              <w:rPr>
+                <w:b w:val="0"/>
+                <w:sz w:val="18"/>
+              </w:rPr>
+              <w:t xml:space="preserve">Title block: the commit hash of the code version used (e.g. the release commit of branch </w:t>
+            </w:r>
+            <w:r>
+              <w:rPr>
+                <w:rFonts w:ascii="Consolas" w:hAnsi="Consolas"/>
+                <w:sz w:val="16"/>
+              </w:rPr>
+              <w:t>photodiode-latency-calibration</w:t>
+            </w:r>
+            <w:r>
+              <w:rPr>
+                <w:b w:val="0"/>
+                <w:sz w:val="18"/>
+              </w:rPr>
+              <w:t>).</w:t>
+            </w:r>
+          </w:p>
+          <w:p>
+            <w:pPr>
+              <w:pStyle w:val="ListBullet"/>
+              <w:spacing w:after="20"/>
+            </w:pPr>
+            <w:r>
+              <w:rPr>
+                <w:b w:val="0"/>
+                <w:sz w:val="18"/>
+              </w:rPr>
+              <w:t>Table S1, recording computer (A): g.HIamp model and channel count, g.HIsys version, liblsl-Matlab version, Windows version (and CPU if wanted).</w:t>
+            </w:r>
+          </w:p>
+          <w:p>
+            <w:pPr>
+              <w:pStyle w:val="ListBullet"/>
+              <w:spacing w:after="20"/>
+            </w:pPr>
+            <w:r>
+              <w:rPr>
+                <w:b w:val="0"/>
+                <w:sz w:val="18"/>
+              </w:rPr>
+              <w:t>Table S1, network: confirm the connection between A and B (currently “local Ethernet”).</w:t>
+            </w:r>
+          </w:p>
+          <w:p>
+            <w:pPr>
+              <w:pStyle w:val="ListBullet"/>
+              <w:spacing w:after="20"/>
+            </w:pPr>
+            <w:r>
+              <w:rPr>
+                <w:b w:val="0"/>
+                <w:sz w:val="18"/>
+              </w:rPr>
+              <w:t>S1.6: confirm per study that hardware, software and display settings were unchanged between calibration and data collection, or report the re-calibration sessions.</w:t>
+            </w:r>
+          </w:p>
+          <w:p>
+            <w:pPr>
+              <w:pStyle w:val="ListBullet"/>
+              <w:spacing w:after="20"/>
+            </w:pPr>
+            <w:r>
+              <w:rPr>
+                <w:b w:val="0"/>
+                <w:sz w:val="18"/>
+              </w:rPr>
+              <w:t>Data and code availability: where the raw recordings are deposited (repository/DOI or Google Drive link) and the access conditions.</w:t>
+            </w:r>
+          </w:p>
+          <w:p>
+            <w:pPr>
+              <w:pStyle w:val="ListBullet"/>
+              <w:spacing w:after="20"/>
+            </w:pPr>
+            <w:r>
+              <w:rPr>
+                <w:b w:val="0"/>
+                <w:sz w:val="18"/>
+              </w:rPr>
+              <w:t>References: replace the Kothe et al. (2024) bioRxiv entry with its final citation if published, and check all DOIs against the journal's reference style.</w:t>
+            </w:r>
+          </w:p>
+          <w:p>
+            <w:pPr>
+              <w:pStyle w:val="ListBullet"/>
+              <w:spacing w:after="20"/>
+            </w:pPr>
+            <w:r>
+              <w:rPr>
+                <w:b w:val="0"/>
+                <w:sz w:val="18"/>
+              </w:rPr>
+              <w:t>Numbering: adapt “Supplementary Material S1” and the S-numbers of tables and figures to the journal's scheme.</w:t>
+            </w:r>
+          </w:p>
+        </w:tc>
+      </w:tr>
+    </w:tbl>
+    <w:p>
+      <w:pPr>
+        <w:spacing w:after="120"/>
+      </w:pPr>
     </w:p>
     <w:p>
       <w:pPr>

</xml_diff>